<commit_message>
update new data, and parser
</commit_message>
<xml_diff>
--- a/data/critical_thinking/docs/a2_gen_chatgpt.docx
+++ b/data/critical_thinking/docs/a2_gen_chatgpt.docx
@@ -4,125 +4,152 @@
   <w:body>
     <w:p>
       <w:r>
-        <w:t>I can do this, but I don’t yet have the “attached economic data.” Please upload the dataset (table, spreadsheet, or image) or paste the numbers and tell me: (1) which countries/region, (2) what years, (3) how “social service spending” is measured (e.g., % of GDP, per capita, real terms), and (4) how “economic growth” is measured (e.g., real GDP growth rate).</w:t>
+        <w:t>## Do these data support the hypothesis that “social service spending is inversely related to economic growth”?</w:t>
         <w:br/>
         <w:br/>
-        <w:t>In the meantime, here is a **five-page-style essay (≤1000 words)** written at a **first-semester undergrad level** that explains *how to judge* whether your data support the hypothesis, and what kinds of patterns would count for or against it. Once you share the actual data, I’ll revise the essay so it directly references your specific figures (e.g., “in 2012–2016, spending rose while growth fell,” etc.).</w:t>
+        <w:t>### Introduction</w:t>
+        <w:br/>
+        <w:br/>
+        <w:t>The hypothesis says that when a country spends a larger share of its economy on social welfare, its economic growth rate should be lower (an inverse relationship). That idea is common in political debate: welfare spending is sometimes portrayed as a drag on growth because it requires higher taxes or might reduce incentives to work or invest. But modern economic research is more mixed. Some welfare spending could reduce growth through distortionary taxation, while other kinds can *support* growth by stabilizing demand in recessions, improving health and education, and lowering poverty-related barriers to productivity. Empirically, whether a simple negative relationship appears depends heavily on **what countries you look at, what years, what type of spending, and whether you control for other factors**.</w:t>
+        <w:br/>
+        <w:br/>
+        <w:t>Using the attached OECD/World Bank snapshots (10 European countries; years 2000, 2005, 2010, 2016, 2019), the data **do not clearly support** a general inverse relationship. At best, they show that countries with high welfare spending can still grow at moderate or even high rates, and that growth varies a lot for reasons unrelated to welfare spending (business cycles, financial crises, demographics, productivity trends, and country-specific shocks). A careful interpretation suggests **no consistent negative pattern** in this small panel, and the direction of causality is ambiguous.</w:t>
         <w:br/>
         <w:br/>
         <w:t>---</w:t>
         <w:br/>
         <w:br/>
-        <w:t>## Do Higher Social Service Spending Levels Reduce Economic Growth? A Data-Based Argument</w:t>
+        <w:t>## What the hypothesis predicts vs. what the data show</w:t>
         <w:br/>
         <w:br/>
-        <w:t>### Introduction</w:t>
+        <w:t>### What we would expect if the hypothesis were strongly supported</w:t>
+        <w:br/>
+        <w:t>If welfare spending as a share of GDP were inversely related to growth, then:</w:t>
+        <w:br/>
+        <w:t>1. Countries with **higher welfare spending** should usually have **lower GDP growth** than countries with lower spending (cross-section).</w:t>
+        <w:br/>
+        <w:t>2. Within a country over time, **increases in welfare spending** should usually be followed by **slower growth** (time-series).</w:t>
+        <w:br/>
+        <w:t>3. The pattern should be fairly consistent across years (not just in one year).</w:t>
         <w:br/>
         <w:br/>
-        <w:t>The hypothesis to evaluate is: **“Social service spending is inversely related to economic growth.”** In plain terms, this claims that when a government spends more on social services (such as health, education, pensions, unemployment insurance, and other welfare programs), the economy tends to grow more slowly. Whether the attached data support this hypothesis depends on whether the spending and growth series move in opposite directions *consistently* and whether other factors could explain the relationship.</w:t>
+        <w:t>### A first look: cross-country comparisons don’t match a clean inverse relationship</w:t>
         <w:br/>
         <w:br/>
-        <w:t>Economic research does not give a single simple answer because government spending can affect growth through multiple channels. Some spending can raise productivity (education, health), while some can reduce incentives or require higher taxes that may discourage investment. The key point is that even if the data show a negative correlation, correlation alone does not prove causation.</w:t>
+        <w:t>Take **2019**. France has the highest welfare spending (31.2% of GDP) and grows at 2.02%. Italy spends 28.2% and grows only 0.43%—that *looks* consistent with the hypothesis. But Belgium (28.9%) grows 2.44%, and Sweden (26.1%) grows 2.55%. Spain spends less (23.7%) and grows 1.96%, which is not clearly higher than the high-spending countries. Germany spends 25.1% and grows only 0.99%. In short: **high spending does not reliably line up with low growth**.</w:t>
         <w:br/>
         <w:br/>
-        <w:t>### What pattern would “support” the hypothesis?</w:t>
+        <w:t>Now look at **2010** (a post-crisis recovery year). Sweden spends 26.3% yet grows 5.75%—one of the highest growth rates in the whole table. Germany spends 25.9% and grows 4.15%. Spain spends 25.8% and grows 0.09% (almost stagnant) despite spending being similar to Germany’s. If the inverse hypothesis were a strong general rule, Sweden and Germany in 2010 would be hard to explain.</w:t>
         <w:br/>
         <w:br/>
-        <w:t>The hypothesis is supported if the data show a **consistent negative association**: higher social service spending corresponds to lower growth across countries, across time, or both. For example:</w:t>
+        <w:t>This is the basic problem: **countries with similar welfare spending show very different growth rates**, and countries with high welfare spending sometimes grow quickly.</w:t>
         <w:br/>
         <w:br/>
-        <w:t>- Countries with **higher social spending shares** (as a percent of GDP) also have **lower average growth rates**.</w:t>
-        <w:br/>
-        <w:t>- When social spending **rises**, growth **falls** in the same period or shortly after.</w:t>
+        <w:t>---</w:t>
         <w:br/>
         <w:br/>
-        <w:t>But to truly support the hypothesis, the pattern should be robust—not just one or two years, not just one country, and not driven by obvious exceptional events (like a recession or a pandemic).</w:t>
+        <w:t>## Within-country patterns: spending and growth move for many reasons (and causality is unclear)</w:t>
         <w:br/>
         <w:br/>
-        <w:t>### Why the relationship might be negative (the “inverse” story)</w:t>
+        <w:t>Even within a single country, the hypothesis doesn’t show up cleanly. Welfare spending as a share of GDP is affected by both the numerator (spending) and the denominator (GDP). During recessions, the ratio can rise automatically because:</w:t>
+        <w:br/>
+        <w:t>- unemployment benefits and social assistance increase, and</w:t>
+        <w:br/>
+        <w:t>- GDP falls or grows slowly, mechanically raising “% of GDP.”</w:t>
         <w:br/>
         <w:br/>
-        <w:t>There are plausible reasons why social service spending could be associated with slower growth:</w:t>
+        <w:t>That means a negative correlation can appear **even if welfare spending didn’t “cause” low growth**—it could be the recession causing both slow growth and higher welfare share. This is a classic **reverse causality** problem.</w:t>
         <w:br/>
         <w:br/>
-        <w:t xml:space="preserve">1. **Tax and distortion effects.** Financing high spending often requires higher taxes. Some taxes can reduce labor supply or private investment, which can reduce long-run growth (Barro, 1990).  </w:t>
+        <w:t>Example: **Spain**</w:t>
         <w:br/>
-        <w:t xml:space="preserve">2. **Crowding out.** Public spending could crowd out private investment if it raises interest rates or absorbs resources that would otherwise go to productive capital (a classic macro argument).  </w:t>
+        <w:t>- Spending rises from 19.5% (2000) to 25.8% (2010).</w:t>
         <w:br/>
-        <w:t>3. **Incentive effects.** Certain benefits can reduce incentives to work, save, or invest if not designed carefully, potentially lowering output growth.</w:t>
+        <w:t>- Growth collapses from 3.91% (2000) to 0.09% (2010).</w:t>
+        <w:br/>
+        <w:t>At face value, this supports the hypothesis. But Spain’s 2010 stagnation is tightly linked to the housing boom-bust and the global financial crisis, not simply welfare generosity. Many economists stress that crises and macro imbalances dominate short-run growth outcomes (and welfare spending often increases *because* of crisis conditions).</w:t>
         <w:br/>
         <w:br/>
-        <w:t>However, even these mechanisms are debated and depend on which programs are funded and how.</w:t>
+        <w:t>Example: **Sweden**</w:t>
+        <w:br/>
+        <w:t>- Spending is high and fairly stable (26–27% range across years).</w:t>
+        <w:br/>
+        <w:t>- Growth swings widely: 4.63% (2000), 2.79% (2005), 5.75% (2010), 2.35% (2016), 2.55% (2019).</w:t>
+        <w:br/>
+        <w:t>Here, growth changes a lot without large changes in spending share—suggesting **spending share is not the main driver**.</w:t>
         <w:br/>
         <w:br/>
-        <w:t>### Why the relationship might be zero or positive (the “human capital” story)</w:t>
+        <w:t>Example: **Germany**</w:t>
+        <w:br/>
+        <w:t>- Spending is around 25–26% throughout.</w:t>
+        <w:br/>
+        <w:t>- Growth changes from 2.88% (2000) to 0.89% (2005) to 4.15% (2010) to 2.29% (2016) to 0.99% (2019).</w:t>
+        <w:br/>
+        <w:t>Again, the same story: **big growth variation with modest spending-share variation**.</w:t>
         <w:br/>
         <w:br/>
-        <w:t>There are also strong reasons the relationship may be weak or even positive:</w:t>
+        <w:t>These within-country patterns weaken the hypothesis because they suggest that growth is driven by broader macro and structural forces, while welfare spending shares are partly cyclical and policy-driven.</w:t>
         <w:br/>
         <w:br/>
-        <w:t xml:space="preserve">1. **Human capital and productivity.** Social spending can improve education and health, increasing worker productivity and long-run growth. Education spending is often linked to higher growth through human capital accumulation (Mankiw, Romer, &amp; Weil, 1992).  </w:t>
-        <w:br/>
-        <w:t xml:space="preserve">2. **Social insurance as economic stabilization.** Programs like unemployment insurance can stabilize household consumption in downturns, reducing the severity of recessions. If the economy is stabilized, growth may be more steady over time.  </w:t>
-        <w:br/>
-        <w:t>3. **Institutions and complementarity.** In many advanced economies, high social spending coexists with high productivity because it is paired with strong institutions and efficient markets; this can break the simple “more spending = less growth” story (Rodrik, 1998).</w:t>
+        <w:t>---</w:t>
         <w:br/>
         <w:br/>
-        <w:t>### A major problem: reverse causality</w:t>
+        <w:t>## The broader research literature: theory and evidence are mixed, not uniformly negative</w:t>
         <w:br/>
         <w:br/>
-        <w:t>A key challenge in interpreting your data is **reverse causality**: slow growth can cause higher social spending, not the other way around. During recessions, unemployment rises and more people qualify for benefits, while GDP falls—this mechanically increases spending as a share of GDP even if policy did not change. That can create a negative relationship even if social spending does not harm growth.</w:t>
+        <w:t>Peer-reviewed research does not give a simple “more welfare spending always reduces growth” conclusion. Instead, findings often depend on:</w:t>
+        <w:br/>
+        <w:t>- whether spending is *transfers* vs. *productive social investment*,</w:t>
+        <w:br/>
+        <w:t>- tax structure and labor market institutions,</w:t>
+        <w:br/>
+        <w:t>- efficiency of public spending,</w:t>
+        <w:br/>
+        <w:t>- demographics (aging raises social spending and can slow growth through labor force effects),</w:t>
+        <w:br/>
+        <w:t>- whether the analysis is short-run (stabilization) vs. long-run (incentives/productivity).</w:t>
         <w:br/>
         <w:br/>
-        <w:t>This issue is common in cross-country research on government size and growth. Studies that try to correct for endogeneity often find the relationship is not as simple as a strong negative slope (Easterly &amp; Rebelo, 1993).</w:t>
+        <w:t>Some studies find negative effects of larger government size on growth under certain conditions, often due to taxation and distortions (Barro, 1991; Fölster &amp; Henrekson, 2001). But other work emphasizes the stabilizing and human-capital-building roles of social policy, especially when spending is designed as “social investment” (Morel, Palier, &amp; Palme, 2012; Hemerijck, 2013). Also, many cross-country growth regressions are sensitive to model specification and country selection, which cautions against simple inferences from small datasets (Levine &amp; Renelt, 1992).</w:t>
         <w:br/>
         <w:br/>
-        <w:t>### How to “read” the attached data in a responsible way</w:t>
+        <w:t>In other words, even before looking at the table, the literature suggests the hypothesis is **too broad**. The attached data, which cover mostly high-income European welfare states, are exactly the kind of sample where you might expect **no strong negative relationship**, because these countries often pair welfare spending with high productivity, strong institutions, and policies that preserve labor force attachment.</w:t>
         <w:br/>
         <w:br/>
-        <w:t>To decide whether the data support the hypothesis, an undergrad-level but careful approach is:</w:t>
+        <w:t>---</w:t>
         <w:br/>
         <w:br/>
-        <w:t xml:space="preserve">1. **Check simple correlation visually and numerically.** Do higher spending observations line up with lower growth? A scatterplot (spending on x-axis, growth on y-axis) is the clearest first step.  </w:t>
-        <w:br/>
-        <w:t xml:space="preserve">2. **Separate short-run cycles from long-run averages.** If the data are yearly, recessions can dominate the relationship. Comparing **multi-year averages** (e.g., 5-year averages) helps.  </w:t>
-        <w:br/>
-        <w:t xml:space="preserve">3. **Watch out for omitted variables.** Growth depends on many things: demographics, trade shocks, technology, monetary policy, global crises. If these are not considered, the spending-growth link may be misleading.  </w:t>
-        <w:br/>
-        <w:t>4. **Consider composition, not just total.** “Social services” includes very different items. Growth effects of education or childcare may differ from pensions. Aggregation can hide offsetting effects.</w:t>
+        <w:t>## What *can* be said based on the attached data (and what cannot)</w:t>
         <w:br/>
         <w:br/>
-        <w:t>### What existing peer-reviewed research suggests</w:t>
+        <w:t>### What the data support</w:t>
+        <w:br/>
+        <w:t>1. **There is no consistent inverse relationship** across the countries and years shown. Some high-spending countries grow faster than lower-spending countries in the same year (e.g., Sweden 2010; Belgium 2019).</w:t>
+        <w:br/>
+        <w:t>2. **Growth varies much more than welfare spending shares do**. Spending shares move within a band of roughly 20%–31%, while growth swings from near zero to above 5%.</w:t>
+        <w:br/>
+        <w:t>3. **Business-cycle timing matters.** Years like 2010 reflect post-crisis dynamics; welfare ratios and growth rates in such years are influenced by shocks and recovery patterns.</w:t>
         <w:br/>
         <w:br/>
-        <w:t>Peer-reviewed research generally finds that **the effect of government/social spending on growth is mixed and depends on type and context**:</w:t>
+        <w:t>### What the data do *not* support (because they are not designed to)</w:t>
+        <w:br/>
+        <w:t>1. They do not identify **causality**. We can’t tell whether welfare spending affects growth or whether slow growth increases welfare spending (reverse causality).</w:t>
+        <w:br/>
+        <w:t>2. They do not control for confounding factors (investment, productivity growth, aging, monetary policy, openness, debt levels, crisis exposure).</w:t>
+        <w:br/>
+        <w:t>3. They do not distinguish **types of welfare spending** (pensions vs. unemployment insurance vs. family policy vs. health). Different components plausibly have different growth effects.</w:t>
         <w:br/>
         <w:br/>
-        <w:t xml:space="preserve">- Barro (1990) argues that certain productive government services can raise growth, while distortionary taxation can reduce it, implying ambiguous net effects depending on policy design.  </w:t>
-        <w:br/>
-        <w:t xml:space="preserve">- Mankiw, Romer, &amp; Weil (1992) show human capital is central to explaining income differences and growth patterns, supporting the idea that some social spending (education/health-related) could be growth-enhancing.  </w:t>
-        <w:br/>
-        <w:t xml:space="preserve">- Easterly &amp; Rebelo (1993) find that simple cross-country links between spending and growth are sensitive and complicated; results depend on how spending is measured and on econometric choices.  </w:t>
-        <w:br/>
-        <w:t xml:space="preserve">- Perotti (1996) emphasizes that redistributive policies and inequality interact with growth in complex ways; the sign can differ across settings.  </w:t>
-        <w:br/>
-        <w:t>- Rodrik (1998) argues that more open economies often have larger governments as a form of social insurance, implying that high spending may correlate with growth-related structural features rather than cause low growth.</w:t>
+        <w:t>---</w:t>
         <w:br/>
         <w:br/>
-        <w:t>### Conclusion: do the data “support” the hypothesis?</w:t>
+        <w:t>## Conclusion: Setting the record straight</w:t>
         <w:br/>
         <w:br/>
-        <w:t>Without seeing the attached numbers, the most defensible conclusion template is:</w:t>
+        <w:t>Based on the attached OECD/World Bank data, the hypothesis that “social service spending is inversely related to economic growth” is **not strongly supported**. If anything, the dataset shows that high welfare-spending countries can still achieve solid growth, and that growth differences across these countries often reflect macroeconomic shocks and structural conditions more than welfare spending levels.</w:t>
         <w:br/>
         <w:br/>
-        <w:t xml:space="preserve">- If your dataset shows a **consistent, strong, and broad negative association** between social spending and growth (across many years/countries), then the data **provide some support** for the hypothesis at a descriptive level.  </w:t>
-        <w:br/>
-        <w:t xml:space="preserve">- But even then, the data alone typically **cannot prove** that social spending reduces growth because reverse causality and omitted variables are likely.  </w:t>
-        <w:br/>
-        <w:t>- If the pattern is weak, inconsistent, or differs by period/country (e.g., high-spending countries sometimes grow faster), then the data **do not support** the hypothesis and instead suggest the relationship is conditional or non-linear.</w:t>
-        <w:br/>
-        <w:br/>
-        <w:t>Once you provide the attached data, I can write the final version that directly references the actual trends and gives a clear verdict (supports / partially supports / does not support), grounded in the numbers.</w:t>
+        <w:t>A more defensible claim—consistent with both the mixed academic literature and the patterns here—would be: **the growth impact of social welfare spending depends on design, financing, and economic context, and simple correlations can be misleading because spending shares are cyclical and causality runs both ways**. To really test the hypothesis, you would need a larger dataset (more countries and years) and an econometric strategy that addresses reverse causality (e.g., instrumental variables, lag structures, or policy reform episodes) while controlling for major determinants of growth.</w:t>
         <w:br/>
         <w:br/>
         <w:t>---</w:t>
@@ -131,21 +158,18 @@
         <w:t>## References (peer-reviewed)</w:t>
         <w:br/>
         <w:br/>
-        <w:t xml:space="preserve">- Barro, R. J. (1990). Government spending in a simple model of endogenous growth. *Journal of Political Economy, 98*(5), S103–S125.  </w:t>
+        <w:t xml:space="preserve">- Barro, R. J. (1991). Economic growth in a cross section of countries. *The Quarterly Journal of Economics, 106*(2), 407–443.  </w:t>
         <w:br/>
-        <w:t xml:space="preserve">- Easterly, W., &amp; Rebelo, S. (1993). Fiscal policy and economic growth: An empirical investigation. *Journal of Monetary Economics, 32*(3), 417–458.  </w:t>
+        <w:t xml:space="preserve">- Fölster, S., &amp; Henrekson, M. (2001). Growth effects of government expenditure and taxation in rich countries. *European Economic Review, 45*(8), 1501–1520.  </w:t>
         <w:br/>
-        <w:t xml:space="preserve">- Mankiw, N. G., Romer, D., &amp; Weil, D. N. (1992). A contribution to the empirics of economic growth. *Quarterly Journal of Economics, 107*(2), 407–437.  </w:t>
+        <w:t xml:space="preserve">- Hemerijck, A. (2013). *Changing Welfare States*. Oxford University Press. (Scholarly, peer-reviewed academic monograph)  </w:t>
         <w:br/>
-        <w:t xml:space="preserve">- Perotti, R. (1996). Growth, income distribution, and democracy: What the data say. *Journal of Economic Growth, 1*(2), 149–187.  </w:t>
+        <w:t xml:space="preserve">- Levine, R., &amp; Renelt, D. (1992). A sensitivity analysis of cross-country growth regressions. *The American Economic Review, 82*(4), 942–963.  </w:t>
         <w:br/>
-        <w:t>- Rodrik, D. (1998). Why do more open economies have bigger governments? *Journal of Political Economy, 106*(5), 997–1032.</w:t>
+        <w:t>- Morel, N., Palier, B., &amp; Palme, J. (Eds.). (2012). *Towards a Social Investment Welfare State?* Policy Press. (Scholarly, peer-reviewed edited volume)</w:t>
         <w:br/>
         <w:br/>
-        <w:t>---</w:t>
-        <w:br/>
-        <w:br/>
-        <w:t>If you upload the data (even a photo of a table is fine), I’ll (1) summarize what the data show, (2) explicitly argue whether they support the hypothesis, and (3) tailor the essay to your exact variables and time period—still under 1000 words.</w:t>
+        <w:t>If you want, I can (1) compute simple correlations from your table (by year and pooled), and (2) rewrite the argument as a more “first-semester” paper with a clearer thesis paragraph, topic sentences, and simpler explanations—without changing the core conclusion.</w:t>
       </w:r>
     </w:p>
     <w:sectPr>

</xml_diff>